<commit_message>
Updated stock price prediction
</commit_message>
<xml_diff>
--- a/Ealisha resume.docx
+++ b/Ealisha resume.docx
@@ -1,6 +1,6 @@
 
 <file path=word/document.xml><?xml version="1.0" encoding="utf-8"?>
-<w:document xmlns:wpc="http://schemas.microsoft.com/office/word/2010/wordprocessingCanvas" xmlns:cx="http://schemas.microsoft.com/office/drawing/2014/chartex" xmlns:cx1="http://schemas.microsoft.com/office/drawing/2015/9/8/chartex" xmlns:cx2="http://schemas.microsoft.com/office/drawing/2015/10/21/chartex" xmlns:cx3="http://schemas.microsoft.com/office/drawing/2016/5/9/chartex" xmlns:cx4="http://schemas.microsoft.com/office/drawing/2016/5/10/chartex" xmlns:cx5="http://schemas.microsoft.com/office/drawing/2016/5/11/chartex" xmlns:cx6="http://schemas.microsoft.com/office/drawing/2016/5/12/chartex" xmlns:cx7="http://schemas.microsoft.com/office/drawing/2016/5/13/chartex" xmlns:cx8="http://schemas.microsoft.com/office/drawing/2016/5/14/chartex" xmlns:mc="http://schemas.openxmlformats.org/markup-compatibility/2006" xmlns:aink="http://schemas.microsoft.com/office/drawing/2016/ink" xmlns:am3d="http://schemas.microsoft.com/office/drawing/2017/model3d" xmlns:o="urn:schemas-microsoft-com:office:office" xmlns:oel="http://schemas.microsoft.com/office/2019/extlst" xmlns:r="http://schemas.openxmlformats.org/officeDocument/2006/relationships" xmlns:m="http://schemas.openxmlformats.org/officeDocument/2006/math" xmlns:v="urn:schemas-microsoft-com:vml" xmlns:wp14="http://schemas.microsoft.com/office/word/2010/wordprocessingDrawing" xmlns:wp="http://schemas.openxmlformats.org/drawingml/2006/wordprocessingDrawing" xmlns:w10="urn:schemas-microsoft-com:office:word" xmlns:w="http://schemas.openxmlformats.org/wordprocessingml/2006/main" xmlns:w14="http://schemas.microsoft.com/office/word/2010/wordml" xmlns:w15="http://schemas.microsoft.com/office/word/2012/wordml" xmlns:w16cei="http://schemas.microsoft.com/office/word/2026/wordml/cei" xmlns:w16cex="http://schemas.microsoft.com/office/word/2018/wordml/cex" xmlns:w16cid="http://schemas.microsoft.com/office/word/2016/wordml/cid" xmlns:w16="http://schemas.microsoft.com/office/word/2018/wordml" xmlns:w16du="http://schemas.microsoft.com/office/word/2023/wordml/word16du" xmlns:w16sdtdh="http://schemas.microsoft.com/office/word/2020/wordml/sdtdatahash" xmlns:w16sdtfl="http://schemas.microsoft.com/office/word/2024/wordml/sdtformatlock" xmlns:w16se="http://schemas.microsoft.com/office/word/2015/wordml/symex" xmlns:wpg="http://schemas.microsoft.com/office/word/2010/wordprocessingGroup" xmlns:wpi="http://schemas.microsoft.com/office/word/2010/wordprocessingInk" xmlns:wne="http://schemas.microsoft.com/office/word/2006/wordml" xmlns:wps="http://schemas.microsoft.com/office/word/2010/wordprocessingShape" mc:Ignorable="w14 w15 w16se w16cid w16 w16cex w16sdtdh w16sdtfl w16du wp14">
+<w:document xmlns:wpc="http://schemas.microsoft.com/office/word/2010/wordprocessingCanvas" xmlns:cx="http://schemas.microsoft.com/office/drawing/2014/chartex" xmlns:cx1="http://schemas.microsoft.com/office/drawing/2015/9/8/chartex" xmlns:cx2="http://schemas.microsoft.com/office/drawing/2015/10/21/chartex" xmlns:cx3="http://schemas.microsoft.com/office/drawing/2016/5/9/chartex" xmlns:cx4="http://schemas.microsoft.com/office/drawing/2016/5/10/chartex" xmlns:cx5="http://schemas.microsoft.com/office/drawing/2016/5/11/chartex" xmlns:cx6="http://schemas.microsoft.com/office/drawing/2016/5/12/chartex" xmlns:cx7="http://schemas.microsoft.com/office/drawing/2016/5/13/chartex" xmlns:cx8="http://schemas.microsoft.com/office/drawing/2016/5/14/chartex" xmlns:mc="http://schemas.openxmlformats.org/markup-compatibility/2006" xmlns:aink="http://schemas.microsoft.com/office/drawing/2016/ink" xmlns:am3d="http://schemas.microsoft.com/office/drawing/2017/model3d" xmlns:o="urn:schemas-microsoft-com:office:office" xmlns:oel="http://schemas.microsoft.com/office/2019/extlst" xmlns:r="http://schemas.openxmlformats.org/officeDocument/2006/relationships" xmlns:m="http://schemas.openxmlformats.org/officeDocument/2006/math" xmlns:v="urn:schemas-microsoft-com:vml" xmlns:wp14="http://schemas.microsoft.com/office/word/2010/wordprocessingDrawing" xmlns:wp="http://schemas.openxmlformats.org/drawingml/2006/wordprocessingDrawing" xmlns:w10="urn:schemas-microsoft-com:office:word" xmlns:w="http://schemas.openxmlformats.org/wordprocessingml/2006/main" xmlns:w14="http://schemas.microsoft.com/office/word/2010/wordml" xmlns:w15="http://schemas.microsoft.com/office/word/2012/wordml" xmlns:w16cex="http://schemas.microsoft.com/office/word/2018/wordml/cex" xmlns:w16cid="http://schemas.microsoft.com/office/word/2016/wordml/cid" xmlns:w16="http://schemas.microsoft.com/office/word/2018/wordml" xmlns:w16du="http://schemas.microsoft.com/office/word/2023/wordml/word16du" xmlns:w16sdtdh="http://schemas.microsoft.com/office/word/2020/wordml/sdtdatahash" xmlns:w16sdtfl="http://schemas.microsoft.com/office/word/2024/wordml/sdtformatlock" xmlns:w16se="http://schemas.microsoft.com/office/word/2015/wordml/symex" xmlns:wpg="http://schemas.microsoft.com/office/word/2010/wordprocessingGroup" xmlns:wpi="http://schemas.microsoft.com/office/word/2010/wordprocessingInk" xmlns:wne="http://schemas.microsoft.com/office/word/2006/wordml" xmlns:wps="http://schemas.microsoft.com/office/word/2010/wordprocessingShape" mc:Ignorable="w14 w15 w16se w16cid w16 w16cex w16sdtdh w16sdtfl w16du wp14">
   <w:body>
     <w:p>
       <w:pPr>
@@ -146,6 +146,9 @@
         <w:t xml:space="preserve">, </w:t>
       </w:r>
       <w:r>
+        <w:t xml:space="preserve">Tailwind, </w:t>
+      </w:r>
+      <w:r>
         <w:t>Bootstrap</w:t>
       </w:r>
       <w:r>
@@ -239,7 +242,17 @@
         <w:pStyle w:val="ListBullet"/>
       </w:pPr>
       <w:r>
-        <w:t>Developed a full-stack web application using React for the frontend and Python for data processing, enabling real-time stock tracking and trend analysis.</w:t>
+        <w:t xml:space="preserve">Developed a full-stack web application using </w:t>
+      </w:r>
+      <w:r>
+        <w:rPr>
+          <w:b/>
+          <w:bCs/>
+        </w:rPr>
+        <w:t>React f</w:t>
+      </w:r>
+      <w:r>
+        <w:t>or the frontend and Python for data processing, enabling real-time stock tracking and trend analysis.</w:t>
       </w:r>
     </w:p>
     <w:p>
@@ -247,15 +260,43 @@
         <w:pStyle w:val="ListBullet"/>
       </w:pPr>
       <w:r>
-        <w:t>Integrated third-party financial REST APIs (</w:t>
+        <w:t xml:space="preserve">Integrated third-party financial </w:t>
+      </w:r>
+      <w:r>
+        <w:rPr>
+          <w:b/>
+          <w:bCs/>
+        </w:rPr>
+        <w:t>REST APIs (</w:t>
       </w:r>
       <w:proofErr w:type="spellStart"/>
       <w:r>
+        <w:rPr>
+          <w:b/>
+          <w:bCs/>
+        </w:rPr>
         <w:t>Finnhub</w:t>
       </w:r>
       <w:proofErr w:type="spellEnd"/>
       <w:r>
-        <w:t>) to stream live market data and render interactive charts for 10+ tickers.</w:t>
+        <w:rPr>
+          <w:b/>
+          <w:bCs/>
+        </w:rPr>
+        <w:t>)</w:t>
+      </w:r>
+      <w:r>
+        <w:t xml:space="preserve"> to stream live market data and render interactive charts for </w:t>
+      </w:r>
+      <w:r>
+        <w:rPr>
+          <w:b/>
+          <w:bCs/>
+        </w:rPr>
+        <w:t>10+ tickers</w:t>
+      </w:r>
+      <w:r>
+        <w:t>.</w:t>
       </w:r>
     </w:p>
     <w:p>
@@ -271,7 +312,24 @@
         <w:pStyle w:val="ListBullet"/>
       </w:pPr>
       <w:r>
-        <w:t>Version-controlled the codebase on GitHub using feature-branch workflow and modularized components for readability and reuse.</w:t>
+        <w:rPr>
+          <w:b/>
+          <w:bCs/>
+        </w:rPr>
+        <w:t>Version-controlled</w:t>
+      </w:r>
+      <w:r>
+        <w:t xml:space="preserve"> the codebase on </w:t>
+      </w:r>
+      <w:r>
+        <w:rPr>
+          <w:b/>
+          <w:bCs/>
+        </w:rPr>
+        <w:t xml:space="preserve">GitHub </w:t>
+      </w:r>
+      <w:r>
+        <w:t>using feature-branch workflow and modularized components for readability and reuse.</w:t>
       </w:r>
     </w:p>
     <w:p>
@@ -279,27 +337,68 @@
         <w:tabs>
           <w:tab w:val="right" w:pos="10224"/>
         </w:tabs>
+        <w:rPr>
+          <w:b/>
+        </w:rPr>
       </w:pPr>
-      <w:proofErr w:type="spellStart"/>
       <w:r>
         <w:rPr>
           <w:b/>
         </w:rPr>
-        <w:t>VeriWipe</w:t>
+        <w:t xml:space="preserve">Custom Redis Server in Java </w:t>
+      </w:r>
+      <w:r>
+        <w:rPr>
+          <w:b/>
+        </w:rPr>
+        <w:t xml:space="preserve">                           </w:t>
+      </w:r>
+      <w:proofErr w:type="spellStart"/>
+      <w:r>
+        <w:rPr>
+          <w:i/>
+        </w:rPr>
+        <w:t>Java</w:t>
       </w:r>
       <w:proofErr w:type="spellEnd"/>
       <w:r>
         <w:rPr>
-          <w:b/>
+          <w:i/>
         </w:rPr>
-        <w:t xml:space="preserve"> — AI-Powered, Blockchain-Certified Data Wiping Solution</w:t>
+        <w:t xml:space="preserve"> 17, TCP Sockets, RESP Protocol, Multithreading, Git, </w:t>
       </w:r>
+      <w:proofErr w:type="spellStart"/>
       <w:r>
         <w:rPr>
           <w:i/>
         </w:rPr>
-        <w:tab/>
-        <w:t>Python, Linux, Cryptography, Blockchain</w:t>
+        <w:t>CodeCrafters</w:t>
+      </w:r>
+      <w:proofErr w:type="spellEnd"/>
+    </w:p>
+    <w:p>
+      <w:pPr>
+        <w:pStyle w:val="ListBullet"/>
+      </w:pPr>
+      <w:r>
+        <w:t xml:space="preserve">Engineered a lightweight, in-memory Redis-compliant key-value server from scratch in </w:t>
+      </w:r>
+      <w:r>
+        <w:rPr>
+          <w:b/>
+          <w:bCs/>
+        </w:rPr>
+        <w:t>Java</w:t>
+      </w:r>
+      <w:r>
+        <w:t xml:space="preserve">, processing client TCP connections on </w:t>
+      </w:r>
+      <w:r>
+        <w:rPr>
+          <w:b/>
+          <w:bCs/>
+        </w:rPr>
+        <w:t>port 6379.</w:t>
       </w:r>
     </w:p>
     <w:p>
@@ -307,7 +406,27 @@
         <w:pStyle w:val="ListBullet"/>
       </w:pPr>
       <w:r>
-        <w:t>Engineered an end-to-end data-sanitization platform that securely erases storage media and issues tamper-proof certificates, addressing trust and compliance gaps in IT Asset Disposition (ITAD).</w:t>
+        <w:t xml:space="preserve">Implemented parsing and serialization for the </w:t>
+      </w:r>
+      <w:r>
+        <w:rPr>
+          <w:b/>
+          <w:bCs/>
+        </w:rPr>
+        <w:t>Redis Serialization Protocol (RESP),</w:t>
+      </w:r>
+      <w:r>
+        <w:t xml:space="preserve"> reducing network packet response latency to </w:t>
+      </w:r>
+      <w:r>
+        <w:rPr>
+          <w:b/>
+          <w:bCs/>
+        </w:rPr>
+        <w:t>&lt; 5ms</w:t>
+      </w:r>
+      <w:r>
+        <w:t xml:space="preserve"> for basic commands.</w:t>
       </w:r>
     </w:p>
     <w:p>
@@ -315,15 +434,45 @@
         <w:pStyle w:val="ListBullet"/>
       </w:pPr>
       <w:r>
-        <w:t xml:space="preserve">Developed a custom bootable Linux environment that runs independently of the host OS, enabling low-level wiping of HDDs, SSDs, and </w:t>
+        <w:t xml:space="preserve">Optimized byte-stream handling using custom </w:t>
       </w:r>
-      <w:proofErr w:type="spellStart"/>
       <w:r>
-        <w:t>NVMe</w:t>
+        <w:rPr>
+          <w:b/>
+          <w:bCs/>
+        </w:rPr>
+        <w:t>1024-byte</w:t>
       </w:r>
-      <w:proofErr w:type="spellEnd"/>
       <w:r>
-        <w:t xml:space="preserve"> drives on decommissioned enterprise hardware.</w:t>
+        <w:t xml:space="preserve"> </w:t>
+      </w:r>
+      <w:r>
+        <w:rPr>
+          <w:b/>
+          <w:bCs/>
+        </w:rPr>
+        <w:t>read buffers</w:t>
+      </w:r>
+      <w:r>
+        <w:t xml:space="preserve"> and explicit stream flushing (</w:t>
+      </w:r>
+      <w:proofErr w:type="gramStart"/>
+      <w:r>
+        <w:t>flush(</w:t>
+      </w:r>
+      <w:proofErr w:type="gramEnd"/>
+      <w:r>
+        <w:t xml:space="preserve">)), ensuring </w:t>
+      </w:r>
+      <w:r>
+        <w:rPr>
+          <w:b/>
+          <w:bCs/>
+        </w:rPr>
+        <w:t>100% data delivery accuracy</w:t>
+      </w:r>
+      <w:r>
+        <w:t xml:space="preserve"> over raw socket connections.</w:t>
       </w:r>
     </w:p>
     <w:p>
@@ -331,23 +480,39 @@
         <w:pStyle w:val="ListBullet"/>
       </w:pPr>
       <w:r>
-        <w:t>Implemented NIST SP 800-88 compliant wiping algorithms (Clear, Purge, Crypto Erase) with device-aware logic to select the optimal method per storage type.</w:t>
+        <w:t xml:space="preserve">Automated local build and deployment pipelines with </w:t>
       </w:r>
-    </w:p>
-    <w:p>
-      <w:pPr>
-        <w:pStyle w:val="ListBullet"/>
-      </w:pPr>
       <w:r>
-        <w:t xml:space="preserve">Built an automated verification engine that inspects wiped sectors and uses AI to flag residual data anomalies, then anchors the signed audit report to a blockchain for immutable, </w:t>
+        <w:rPr>
+          <w:b/>
+          <w:bCs/>
+        </w:rPr>
+        <w:t>Maven and Git</w:t>
       </w:r>
-      <w:proofErr w:type="gramStart"/>
       <w:r>
-        <w:t>third-party</w:t>
+        <w:t xml:space="preserve">, achieving </w:t>
       </w:r>
-      <w:proofErr w:type="gramEnd"/>
       <w:r>
-        <w:t>-verifiable proof of erasure.</w:t>
+        <w:rPr>
+          <w:b/>
+          <w:bCs/>
+        </w:rPr>
+        <w:t>100% test coverage</w:t>
+      </w:r>
+      <w:r>
+        <w:t xml:space="preserve"> compliance across </w:t>
+      </w:r>
+      <w:proofErr w:type="spellStart"/>
+      <w:r>
+        <w:rPr>
+          <w:b/>
+          <w:bCs/>
+        </w:rPr>
+        <w:t>CodeCrafters</w:t>
+      </w:r>
+      <w:proofErr w:type="spellEnd"/>
+      <w:r>
+        <w:t xml:space="preserve"> automated validation suites.</w:t>
       </w:r>
     </w:p>
     <w:p>
@@ -546,7 +711,7 @@
 </file>
 
 <file path=word/numbering.xml><?xml version="1.0" encoding="utf-8"?>
-<w:numbering xmlns:wpc="http://schemas.microsoft.com/office/word/2010/wordprocessingCanvas" xmlns:cx="http://schemas.microsoft.com/office/drawing/2014/chartex" xmlns:cx1="http://schemas.microsoft.com/office/drawing/2015/9/8/chartex" xmlns:cx2="http://schemas.microsoft.com/office/drawing/2015/10/21/chartex" xmlns:cx3="http://schemas.microsoft.com/office/drawing/2016/5/9/chartex" xmlns:cx4="http://schemas.microsoft.com/office/drawing/2016/5/10/chartex" xmlns:cx5="http://schemas.microsoft.com/office/drawing/2016/5/11/chartex" xmlns:cx6="http://schemas.microsoft.com/office/drawing/2016/5/12/chartex" xmlns:cx7="http://schemas.microsoft.com/office/drawing/2016/5/13/chartex" xmlns:cx8="http://schemas.microsoft.com/office/drawing/2016/5/14/chartex" xmlns:mc="http://schemas.openxmlformats.org/markup-compatibility/2006" xmlns:aink="http://schemas.microsoft.com/office/drawing/2016/ink" xmlns:am3d="http://schemas.microsoft.com/office/drawing/2017/model3d" xmlns:o="urn:schemas-microsoft-com:office:office" xmlns:oel="http://schemas.microsoft.com/office/2019/extlst" xmlns:r="http://schemas.openxmlformats.org/officeDocument/2006/relationships" xmlns:m="http://schemas.openxmlformats.org/officeDocument/2006/math" xmlns:v="urn:schemas-microsoft-com:vml" xmlns:wp14="http://schemas.microsoft.com/office/word/2010/wordprocessingDrawing" xmlns:wp="http://schemas.openxmlformats.org/drawingml/2006/wordprocessingDrawing" xmlns:w10="urn:schemas-microsoft-com:office:word" xmlns:w="http://schemas.openxmlformats.org/wordprocessingml/2006/main" xmlns:w14="http://schemas.microsoft.com/office/word/2010/wordml" xmlns:w15="http://schemas.microsoft.com/office/word/2012/wordml" xmlns:w16cei="http://schemas.microsoft.com/office/word/2026/wordml/cei" xmlns:w16cex="http://schemas.microsoft.com/office/word/2018/wordml/cex" xmlns:w16cid="http://schemas.microsoft.com/office/word/2016/wordml/cid" xmlns:w16="http://schemas.microsoft.com/office/word/2018/wordml" xmlns:w16du="http://schemas.microsoft.com/office/word/2023/wordml/word16du" xmlns:w16sdtdh="http://schemas.microsoft.com/office/word/2020/wordml/sdtdatahash" xmlns:w16sdtfl="http://schemas.microsoft.com/office/word/2024/wordml/sdtformatlock" xmlns:w16se="http://schemas.microsoft.com/office/word/2015/wordml/symex" xmlns:wpg="http://schemas.microsoft.com/office/word/2010/wordprocessingGroup" xmlns:wpi="http://schemas.microsoft.com/office/word/2010/wordprocessingInk" xmlns:wne="http://schemas.microsoft.com/office/word/2006/wordml" xmlns:wps="http://schemas.microsoft.com/office/word/2010/wordprocessingShape" mc:Ignorable="w14 w15 w16se w16cid w16 w16cex w16sdtdh w16sdtfl w16du wp14">
+<w:numbering xmlns:wpc="http://schemas.microsoft.com/office/word/2010/wordprocessingCanvas" xmlns:cx="http://schemas.microsoft.com/office/drawing/2014/chartex" xmlns:cx1="http://schemas.microsoft.com/office/drawing/2015/9/8/chartex" xmlns:cx2="http://schemas.microsoft.com/office/drawing/2015/10/21/chartex" xmlns:cx3="http://schemas.microsoft.com/office/drawing/2016/5/9/chartex" xmlns:cx4="http://schemas.microsoft.com/office/drawing/2016/5/10/chartex" xmlns:cx5="http://schemas.microsoft.com/office/drawing/2016/5/11/chartex" xmlns:cx6="http://schemas.microsoft.com/office/drawing/2016/5/12/chartex" xmlns:cx7="http://schemas.microsoft.com/office/drawing/2016/5/13/chartex" xmlns:cx8="http://schemas.microsoft.com/office/drawing/2016/5/14/chartex" xmlns:mc="http://schemas.openxmlformats.org/markup-compatibility/2006" xmlns:aink="http://schemas.microsoft.com/office/drawing/2016/ink" xmlns:am3d="http://schemas.microsoft.com/office/drawing/2017/model3d" xmlns:o="urn:schemas-microsoft-com:office:office" xmlns:oel="http://schemas.microsoft.com/office/2019/extlst" xmlns:r="http://schemas.openxmlformats.org/officeDocument/2006/relationships" xmlns:m="http://schemas.openxmlformats.org/officeDocument/2006/math" xmlns:v="urn:schemas-microsoft-com:vml" xmlns:wp14="http://schemas.microsoft.com/office/word/2010/wordprocessingDrawing" xmlns:wp="http://schemas.openxmlformats.org/drawingml/2006/wordprocessingDrawing" xmlns:w10="urn:schemas-microsoft-com:office:word" xmlns:w="http://schemas.openxmlformats.org/wordprocessingml/2006/main" xmlns:w14="http://schemas.microsoft.com/office/word/2010/wordml" xmlns:w15="http://schemas.microsoft.com/office/word/2012/wordml" xmlns:w16cex="http://schemas.microsoft.com/office/word/2018/wordml/cex" xmlns:w16cid="http://schemas.microsoft.com/office/word/2016/wordml/cid" xmlns:w16="http://schemas.microsoft.com/office/word/2018/wordml" xmlns:w16du="http://schemas.microsoft.com/office/word/2023/wordml/word16du" xmlns:w16sdtdh="http://schemas.microsoft.com/office/word/2020/wordml/sdtdatahash" xmlns:w16sdtfl="http://schemas.microsoft.com/office/word/2024/wordml/sdtformatlock" xmlns:w16se="http://schemas.microsoft.com/office/word/2015/wordml/symex" xmlns:wpg="http://schemas.microsoft.com/office/word/2010/wordprocessingGroup" xmlns:wpi="http://schemas.microsoft.com/office/word/2010/wordprocessingInk" xmlns:wne="http://schemas.microsoft.com/office/word/2006/wordml" xmlns:wps="http://schemas.microsoft.com/office/word/2010/wordprocessingShape" mc:Ignorable="w14 w15 w16se w16cid w16 w16cex w16sdtdh w16sdtfl w16du wp14">
   <w:abstractNum w:abstractNumId="0" w15:restartNumberingAfterBreak="0">
     <w:nsid w:val="FFFFFF7C"/>
     <w:multiLevelType w:val="singleLevel"/>
@@ -718,6 +883,304 @@
       </w:rPr>
     </w:lvl>
   </w:abstractNum>
+  <w:abstractNum w:abstractNumId="9" w15:restartNumberingAfterBreak="0">
+    <w:nsid w:val="13000F40"/>
+    <w:multiLevelType w:val="multilevel"/>
+    <w:tmpl w:val="722A3E92"/>
+    <w:lvl w:ilvl="0">
+      <w:start w:val="1"/>
+      <w:numFmt w:val="bullet"/>
+      <w:lvlText w:val=""/>
+      <w:lvlJc w:val="left"/>
+      <w:pPr>
+        <w:tabs>
+          <w:tab w:val="num" w:pos="720"/>
+        </w:tabs>
+        <w:ind w:left="720" w:hanging="360"/>
+      </w:pPr>
+      <w:rPr>
+        <w:rFonts w:ascii="Symbol" w:hAnsi="Symbol" w:hint="default"/>
+        <w:sz w:val="20"/>
+      </w:rPr>
+    </w:lvl>
+    <w:lvl w:ilvl="1" w:tentative="1">
+      <w:start w:val="1"/>
+      <w:numFmt w:val="bullet"/>
+      <w:lvlText w:val="o"/>
+      <w:lvlJc w:val="left"/>
+      <w:pPr>
+        <w:tabs>
+          <w:tab w:val="num" w:pos="1440"/>
+        </w:tabs>
+        <w:ind w:left="1440" w:hanging="360"/>
+      </w:pPr>
+      <w:rPr>
+        <w:rFonts w:ascii="Courier New" w:hAnsi="Courier New" w:hint="default"/>
+        <w:sz w:val="20"/>
+      </w:rPr>
+    </w:lvl>
+    <w:lvl w:ilvl="2" w:tentative="1">
+      <w:start w:val="1"/>
+      <w:numFmt w:val="bullet"/>
+      <w:lvlText w:val=""/>
+      <w:lvlJc w:val="left"/>
+      <w:pPr>
+        <w:tabs>
+          <w:tab w:val="num" w:pos="2160"/>
+        </w:tabs>
+        <w:ind w:left="2160" w:hanging="360"/>
+      </w:pPr>
+      <w:rPr>
+        <w:rFonts w:ascii="Wingdings" w:hAnsi="Wingdings" w:hint="default"/>
+        <w:sz w:val="20"/>
+      </w:rPr>
+    </w:lvl>
+    <w:lvl w:ilvl="3" w:tentative="1">
+      <w:start w:val="1"/>
+      <w:numFmt w:val="bullet"/>
+      <w:lvlText w:val=""/>
+      <w:lvlJc w:val="left"/>
+      <w:pPr>
+        <w:tabs>
+          <w:tab w:val="num" w:pos="2880"/>
+        </w:tabs>
+        <w:ind w:left="2880" w:hanging="360"/>
+      </w:pPr>
+      <w:rPr>
+        <w:rFonts w:ascii="Wingdings" w:hAnsi="Wingdings" w:hint="default"/>
+        <w:sz w:val="20"/>
+      </w:rPr>
+    </w:lvl>
+    <w:lvl w:ilvl="4" w:tentative="1">
+      <w:start w:val="1"/>
+      <w:numFmt w:val="bullet"/>
+      <w:lvlText w:val=""/>
+      <w:lvlJc w:val="left"/>
+      <w:pPr>
+        <w:tabs>
+          <w:tab w:val="num" w:pos="3600"/>
+        </w:tabs>
+        <w:ind w:left="3600" w:hanging="360"/>
+      </w:pPr>
+      <w:rPr>
+        <w:rFonts w:ascii="Wingdings" w:hAnsi="Wingdings" w:hint="default"/>
+        <w:sz w:val="20"/>
+      </w:rPr>
+    </w:lvl>
+    <w:lvl w:ilvl="5" w:tentative="1">
+      <w:start w:val="1"/>
+      <w:numFmt w:val="bullet"/>
+      <w:lvlText w:val=""/>
+      <w:lvlJc w:val="left"/>
+      <w:pPr>
+        <w:tabs>
+          <w:tab w:val="num" w:pos="4320"/>
+        </w:tabs>
+        <w:ind w:left="4320" w:hanging="360"/>
+      </w:pPr>
+      <w:rPr>
+        <w:rFonts w:ascii="Wingdings" w:hAnsi="Wingdings" w:hint="default"/>
+        <w:sz w:val="20"/>
+      </w:rPr>
+    </w:lvl>
+    <w:lvl w:ilvl="6" w:tentative="1">
+      <w:start w:val="1"/>
+      <w:numFmt w:val="bullet"/>
+      <w:lvlText w:val=""/>
+      <w:lvlJc w:val="left"/>
+      <w:pPr>
+        <w:tabs>
+          <w:tab w:val="num" w:pos="5040"/>
+        </w:tabs>
+        <w:ind w:left="5040" w:hanging="360"/>
+      </w:pPr>
+      <w:rPr>
+        <w:rFonts w:ascii="Wingdings" w:hAnsi="Wingdings" w:hint="default"/>
+        <w:sz w:val="20"/>
+      </w:rPr>
+    </w:lvl>
+    <w:lvl w:ilvl="7" w:tentative="1">
+      <w:start w:val="1"/>
+      <w:numFmt w:val="bullet"/>
+      <w:lvlText w:val=""/>
+      <w:lvlJc w:val="left"/>
+      <w:pPr>
+        <w:tabs>
+          <w:tab w:val="num" w:pos="5760"/>
+        </w:tabs>
+        <w:ind w:left="5760" w:hanging="360"/>
+      </w:pPr>
+      <w:rPr>
+        <w:rFonts w:ascii="Wingdings" w:hAnsi="Wingdings" w:hint="default"/>
+        <w:sz w:val="20"/>
+      </w:rPr>
+    </w:lvl>
+    <w:lvl w:ilvl="8" w:tentative="1">
+      <w:start w:val="1"/>
+      <w:numFmt w:val="bullet"/>
+      <w:lvlText w:val=""/>
+      <w:lvlJc w:val="left"/>
+      <w:pPr>
+        <w:tabs>
+          <w:tab w:val="num" w:pos="6480"/>
+        </w:tabs>
+        <w:ind w:left="6480" w:hanging="360"/>
+      </w:pPr>
+      <w:rPr>
+        <w:rFonts w:ascii="Wingdings" w:hAnsi="Wingdings" w:hint="default"/>
+        <w:sz w:val="20"/>
+      </w:rPr>
+    </w:lvl>
+  </w:abstractNum>
+  <w:abstractNum w:abstractNumId="10" w15:restartNumberingAfterBreak="0">
+    <w:nsid w:val="601F46BE"/>
+    <w:multiLevelType w:val="multilevel"/>
+    <w:tmpl w:val="3FDE8822"/>
+    <w:lvl w:ilvl="0">
+      <w:start w:val="1"/>
+      <w:numFmt w:val="bullet"/>
+      <w:lvlText w:val=""/>
+      <w:lvlJc w:val="left"/>
+      <w:pPr>
+        <w:tabs>
+          <w:tab w:val="num" w:pos="720"/>
+        </w:tabs>
+        <w:ind w:left="720" w:hanging="360"/>
+      </w:pPr>
+      <w:rPr>
+        <w:rFonts w:ascii="Symbol" w:hAnsi="Symbol" w:hint="default"/>
+        <w:sz w:val="20"/>
+      </w:rPr>
+    </w:lvl>
+    <w:lvl w:ilvl="1" w:tentative="1">
+      <w:start w:val="1"/>
+      <w:numFmt w:val="bullet"/>
+      <w:lvlText w:val="o"/>
+      <w:lvlJc w:val="left"/>
+      <w:pPr>
+        <w:tabs>
+          <w:tab w:val="num" w:pos="1440"/>
+        </w:tabs>
+        <w:ind w:left="1440" w:hanging="360"/>
+      </w:pPr>
+      <w:rPr>
+        <w:rFonts w:ascii="Courier New" w:hAnsi="Courier New" w:hint="default"/>
+        <w:sz w:val="20"/>
+      </w:rPr>
+    </w:lvl>
+    <w:lvl w:ilvl="2" w:tentative="1">
+      <w:start w:val="1"/>
+      <w:numFmt w:val="bullet"/>
+      <w:lvlText w:val=""/>
+      <w:lvlJc w:val="left"/>
+      <w:pPr>
+        <w:tabs>
+          <w:tab w:val="num" w:pos="2160"/>
+        </w:tabs>
+        <w:ind w:left="2160" w:hanging="360"/>
+      </w:pPr>
+      <w:rPr>
+        <w:rFonts w:ascii="Wingdings" w:hAnsi="Wingdings" w:hint="default"/>
+        <w:sz w:val="20"/>
+      </w:rPr>
+    </w:lvl>
+    <w:lvl w:ilvl="3" w:tentative="1">
+      <w:start w:val="1"/>
+      <w:numFmt w:val="bullet"/>
+      <w:lvlText w:val=""/>
+      <w:lvlJc w:val="left"/>
+      <w:pPr>
+        <w:tabs>
+          <w:tab w:val="num" w:pos="2880"/>
+        </w:tabs>
+        <w:ind w:left="2880" w:hanging="360"/>
+      </w:pPr>
+      <w:rPr>
+        <w:rFonts w:ascii="Wingdings" w:hAnsi="Wingdings" w:hint="default"/>
+        <w:sz w:val="20"/>
+      </w:rPr>
+    </w:lvl>
+    <w:lvl w:ilvl="4" w:tentative="1">
+      <w:start w:val="1"/>
+      <w:numFmt w:val="bullet"/>
+      <w:lvlText w:val=""/>
+      <w:lvlJc w:val="left"/>
+      <w:pPr>
+        <w:tabs>
+          <w:tab w:val="num" w:pos="3600"/>
+        </w:tabs>
+        <w:ind w:left="3600" w:hanging="360"/>
+      </w:pPr>
+      <w:rPr>
+        <w:rFonts w:ascii="Wingdings" w:hAnsi="Wingdings" w:hint="default"/>
+        <w:sz w:val="20"/>
+      </w:rPr>
+    </w:lvl>
+    <w:lvl w:ilvl="5" w:tentative="1">
+      <w:start w:val="1"/>
+      <w:numFmt w:val="bullet"/>
+      <w:lvlText w:val=""/>
+      <w:lvlJc w:val="left"/>
+      <w:pPr>
+        <w:tabs>
+          <w:tab w:val="num" w:pos="4320"/>
+        </w:tabs>
+        <w:ind w:left="4320" w:hanging="360"/>
+      </w:pPr>
+      <w:rPr>
+        <w:rFonts w:ascii="Wingdings" w:hAnsi="Wingdings" w:hint="default"/>
+        <w:sz w:val="20"/>
+      </w:rPr>
+    </w:lvl>
+    <w:lvl w:ilvl="6" w:tentative="1">
+      <w:start w:val="1"/>
+      <w:numFmt w:val="bullet"/>
+      <w:lvlText w:val=""/>
+      <w:lvlJc w:val="left"/>
+      <w:pPr>
+        <w:tabs>
+          <w:tab w:val="num" w:pos="5040"/>
+        </w:tabs>
+        <w:ind w:left="5040" w:hanging="360"/>
+      </w:pPr>
+      <w:rPr>
+        <w:rFonts w:ascii="Wingdings" w:hAnsi="Wingdings" w:hint="default"/>
+        <w:sz w:val="20"/>
+      </w:rPr>
+    </w:lvl>
+    <w:lvl w:ilvl="7" w:tentative="1">
+      <w:start w:val="1"/>
+      <w:numFmt w:val="bullet"/>
+      <w:lvlText w:val=""/>
+      <w:lvlJc w:val="left"/>
+      <w:pPr>
+        <w:tabs>
+          <w:tab w:val="num" w:pos="5760"/>
+        </w:tabs>
+        <w:ind w:left="5760" w:hanging="360"/>
+      </w:pPr>
+      <w:rPr>
+        <w:rFonts w:ascii="Wingdings" w:hAnsi="Wingdings" w:hint="default"/>
+        <w:sz w:val="20"/>
+      </w:rPr>
+    </w:lvl>
+    <w:lvl w:ilvl="8" w:tentative="1">
+      <w:start w:val="1"/>
+      <w:numFmt w:val="bullet"/>
+      <w:lvlText w:val=""/>
+      <w:lvlJc w:val="left"/>
+      <w:pPr>
+        <w:tabs>
+          <w:tab w:val="num" w:pos="6480"/>
+        </w:tabs>
+        <w:ind w:left="6480" w:hanging="360"/>
+      </w:pPr>
+      <w:rPr>
+        <w:rFonts w:ascii="Wingdings" w:hAnsi="Wingdings" w:hint="default"/>
+        <w:sz w:val="20"/>
+      </w:rPr>
+    </w:lvl>
+  </w:abstractNum>
   <w:num w:numId="1" w16cid:durableId="2126267078">
     <w:abstractNumId w:val="8"/>
   </w:num>
@@ -744,6 +1207,18 @@
   </w:num>
   <w:num w:numId="9" w16cid:durableId="389114574">
     <w:abstractNumId w:val="0"/>
+  </w:num>
+  <w:num w:numId="10" w16cid:durableId="1592085960">
+    <w:abstractNumId w:val="9"/>
+  </w:num>
+  <w:num w:numId="11" w16cid:durableId="1097796815">
+    <w:abstractNumId w:val="8"/>
+  </w:num>
+  <w:num w:numId="12" w16cid:durableId="2110395041">
+    <w:abstractNumId w:val="10"/>
+  </w:num>
+  <w:num w:numId="13" w16cid:durableId="413280261">
+    <w:abstractNumId w:val="8"/>
   </w:num>
 </w:numbering>
 </file>
@@ -1357,7 +1832,6 @@
   <w:style w:type="character" w:default="1" w:styleId="DefaultParagraphFont">
     <w:name w:val="Default Paragraph Font"/>
     <w:uiPriority w:val="1"/>
-    <w:semiHidden/>
     <w:unhideWhenUsed/>
   </w:style>
   <w:style w:type="table" w:default="1" w:styleId="TableNormal">
@@ -12133,6 +12607,35 @@
         <w:shd w:val="clear" w:color="auto" w:fill="FBCAA2" w:themeFill="accent6" w:themeFillTint="7F"/>
       </w:tcPr>
     </w:tblStylePr>
+  </w:style>
+  <w:style w:type="paragraph" w:styleId="NormalWeb">
+    <w:name w:val="Normal (Web)"/>
+    <w:basedOn w:val="Normal"/>
+    <w:uiPriority w:val="99"/>
+    <w:unhideWhenUsed/>
+    <w:rsid w:val="00593B9E"/>
+    <w:pPr>
+      <w:spacing w:before="100" w:beforeAutospacing="1" w:after="100" w:afterAutospacing="1" w:line="240" w:lineRule="auto"/>
+    </w:pPr>
+    <w:rPr>
+      <w:rFonts w:ascii="Times New Roman" w:eastAsia="Times New Roman" w:hAnsi="Times New Roman" w:cs="Times New Roman"/>
+      <w:sz w:val="24"/>
+      <w:szCs w:val="24"/>
+      <w:lang w:val="en-IN" w:eastAsia="en-IN"/>
+    </w:rPr>
+  </w:style>
+  <w:style w:type="character" w:styleId="HTMLCode">
+    <w:name w:val="HTML Code"/>
+    <w:basedOn w:val="DefaultParagraphFont"/>
+    <w:uiPriority w:val="99"/>
+    <w:semiHidden/>
+    <w:unhideWhenUsed/>
+    <w:rsid w:val="00593B9E"/>
+    <w:rPr>
+      <w:rFonts w:ascii="Courier New" w:eastAsia="Times New Roman" w:hAnsi="Courier New" w:cs="Courier New"/>
+      <w:sz w:val="20"/>
+      <w:szCs w:val="20"/>
+    </w:rPr>
   </w:style>
 </w:styles>
 </file>

</xml_diff>